<commit_message>
Expand NKP runbook prerequisites
</commit_message>
<xml_diff>
--- a/nkp-ansible-deployment/docs/NKP-2.18-Ansible-Deployment-Runbook.docx
+++ b/nkp-ansible-deployment/docs/NKP-2.18-Ansible-Deployment-Runbook.docx
@@ -2361,6 +2361,14 @@
     </w:p>
     <w:p>
       <w:pPr>
+        <w:pStyle w:val="Heading2"/>
+      </w:pPr>
+      <w:r>
+        <w:t>5.1 Download and open the repository</w:t>
+      </w:r>
+    </w:p>
+    <w:p>
+      <w:pPr>
         <w:pStyle w:val="ListNumber"/>
       </w:pPr>
       <w:r>
@@ -2381,7 +2389,7 @@
           <w:color w:val="202124"/>
           <w:sz w:val="22"/>
         </w:rPr>
-        <w:t xml:space="preserve"> — Use an x86_64 Linux or macOS machine with Python 3.12 or newer and ansible-core 2.16 or newer.</w:t>
+        <w:t xml:space="preserve"> — Use an x86_64 Ubuntu or other supported Linux controller with Python 3.12 or newer and ansible-core 2.16 or newer.</w:t>
       </w:r>
     </w:p>
     <w:p>
@@ -2396,7 +2404,7 @@
           <w:color w:val="17365D"/>
           <w:sz w:val="22"/>
         </w:rPr>
-        <w:t>Copy the repository</w:t>
+        <w:t>Install the controller prerequisites</w:t>
       </w:r>
       <w:r>
         <w:rPr>
@@ -2406,7 +2414,52 @@
           <w:color w:val="202124"/>
           <w:sz w:val="22"/>
         </w:rPr>
-        <w:t xml:space="preserve"> — Transfer the complete nkp-ansible-deployment directory to the controller.</w:t>
+        <w:t xml:space="preserve"> — On Ubuntu, install Python, pip, Git and the OpenSSH client before cloning the repository.</w:t>
+      </w:r>
+    </w:p>
+    <w:p>
+      <w:pPr>
+        <w:pStyle w:val="Code"/>
+      </w:pPr>
+      <w:r>
+        <w:rPr>
+          <w:rFonts w:ascii="Courier New" w:hAnsi="Courier New"/>
+          <w:b w:val="0"/>
+          <w:i w:val="0"/>
+          <w:color w:val="152238"/>
+          <w:sz w:val="18"/>
+        </w:rPr>
+        <w:t>sudo apt update</w:t>
+      </w:r>
+    </w:p>
+    <w:p>
+      <w:pPr>
+        <w:pStyle w:val="Code"/>
+      </w:pPr>
+      <w:r>
+        <w:rPr>
+          <w:rFonts w:ascii="Courier New" w:hAnsi="Courier New"/>
+          <w:b w:val="0"/>
+          <w:i w:val="0"/>
+          <w:color w:val="152238"/>
+          <w:sz w:val="18"/>
+        </w:rPr>
+        <w:t>sudo apt install -y python3 python3-pip git openssh-client</w:t>
+      </w:r>
+    </w:p>
+    <w:p>
+      <w:pPr>
+        <w:pStyle w:val="Code"/>
+      </w:pPr>
+      <w:r>
+        <w:rPr>
+          <w:rFonts w:ascii="Courier New" w:hAnsi="Courier New"/>
+          <w:b w:val="0"/>
+          <w:i w:val="0"/>
+          <w:color w:val="152238"/>
+          <w:sz w:val="18"/>
+        </w:rPr>
+        <w:t>python3 -m pip install --user 'ansible-core&gt;=2.16'</w:t>
       </w:r>
     </w:p>
     <w:p>
@@ -2421,7 +2474,7 @@
           <w:color w:val="17365D"/>
           <w:sz w:val="22"/>
         </w:rPr>
-        <w:t>Open the repository</w:t>
+        <w:t>Clone the GitHub repository</w:t>
       </w:r>
       <w:r>
         <w:rPr>
@@ -2431,7 +2484,7 @@
           <w:color w:val="202124"/>
           <w:sz w:val="22"/>
         </w:rPr>
-        <w:t xml:space="preserve"> — Use a terminal and change to the repository root.</w:t>
+        <w:t xml:space="preserve"> — Download the Nutanix project and enter the reusable NKP deployment directory.</w:t>
       </w:r>
     </w:p>
     <w:p>
@@ -2446,7 +2499,87 @@
           <w:color w:val="152238"/>
           <w:sz w:val="18"/>
         </w:rPr>
-        <w:t>cd /path/to/nkp-ansible-deployment</w:t>
+        <w:t>git clone https://github.com/varunemailid-cpu/Nutanix-Project.git</w:t>
+      </w:r>
+    </w:p>
+    <w:p>
+      <w:pPr>
+        <w:pStyle w:val="Code"/>
+      </w:pPr>
+      <w:r>
+        <w:rPr>
+          <w:rFonts w:ascii="Courier New" w:hAnsi="Courier New"/>
+          <w:b w:val="0"/>
+          <w:i w:val="0"/>
+          <w:color w:val="152238"/>
+          <w:sz w:val="18"/>
+        </w:rPr>
+        <w:t>cd Nutanix-Project/nkp-ansible-deployment</w:t>
+      </w:r>
+    </w:p>
+    <w:tbl>
+      <w:tblPr>
+        <w:tblW w:type="dxa" w:w="9360"/>
+        <w:jc w:val="left"/>
+        <w:tblLayout w:type="fixed"/>
+        <w:tblLook w:firstColumn="1" w:firstRow="1" w:lastColumn="0" w:lastRow="0" w:noHBand="0" w:noVBand="1" w:val="04A0"/>
+        <w:tblInd w:w="120" w:type="dxa"/>
+      </w:tblPr>
+      <w:tblGrid>
+        <w:gridCol w:w="9360"/>
+      </w:tblGrid>
+      <w:tr>
+        <w:tc>
+          <w:tcPr>
+            <w:tcW w:type="dxa" w:w="9360"/>
+            <w:tcMar>
+              <w:top w:w="80" w:type="dxa"/>
+              <w:start w:w="120" w:type="dxa"/>
+              <w:bottom w:w="80" w:type="dxa"/>
+              <w:end w:w="120" w:type="dxa"/>
+            </w:tcMar>
+            <w:vAlign w:val="center"/>
+            <w:shd w:fill="FFF4CE"/>
+          </w:tcPr>
+          <w:p>
+            <w:pPr>
+              <w:spacing w:after="0"/>
+            </w:pPr>
+            <w:r>
+              <w:rPr>
+                <w:rFonts w:ascii="Calibri" w:hAnsi="Calibri"/>
+                <w:b/>
+                <w:i w:val="0"/>
+                <w:color w:val="7A5A00"/>
+                <w:sz w:val="22"/>
+              </w:rPr>
+              <w:t xml:space="preserve">Offline controller: </w:t>
+            </w:r>
+            <w:r>
+              <w:rPr>
+                <w:rFonts w:ascii="Calibri" w:hAnsi="Calibri"/>
+                <w:b w:val="0"/>
+                <w:i w:val="0"/>
+                <w:color w:val="202124"/>
+                <w:sz w:val="22"/>
+              </w:rPr>
+              <w:t>For an air-gapped environment, clone or download the repository and all Ansible collections on a connected staging machine, then transfer them using approved removable media or the project artifact-transfer process.</w:t>
+            </w:r>
+          </w:p>
+        </w:tc>
+      </w:tr>
+    </w:tbl>
+    <w:p>
+      <w:pPr>
+        <w:spacing w:after="0"/>
+      </w:pPr>
+    </w:p>
+    <w:p>
+      <w:pPr>
+        <w:pStyle w:val="Heading2"/>
+      </w:pPr>
+      <w:r>
+        <w:t>5.2 Install Ansible dependencies</w:t>
       </w:r>
     </w:p>
     <w:p>
@@ -3166,6 +3299,846 @@
                 <w:sz w:val="22"/>
               </w:rPr>
               <w:t>Obtain checksums or signatures from the Nutanix download source and verify packages before copying them into the repository.</w:t>
+            </w:r>
+          </w:p>
+        </w:tc>
+      </w:tr>
+    </w:tbl>
+    <w:p>
+      <w:pPr>
+        <w:spacing w:after="0"/>
+      </w:pPr>
+    </w:p>
+    <w:p>
+      <w:pPr>
+        <w:pStyle w:val="Heading2"/>
+      </w:pPr>
+      <w:r>
+        <w:t>6.3 Bastion operating-system and package requirements</w:t>
+      </w:r>
+    </w:p>
+    <w:p>
+      <w:pPr/>
+      <w:r>
+        <w:rPr>
+          <w:rFonts w:ascii="Calibri" w:hAnsi="Calibri"/>
+          <w:b w:val="0"/>
+          <w:i w:val="0"/>
+          <w:color w:val="202124"/>
+          <w:sz w:val="22"/>
+        </w:rPr>
+        <w:t>The playbook creates the bastion from the Nutanix-provided Ubuntu 24.04 NKP image. The image must be x86_64, use cgroups v2, provide Python 3 for Ansible, and have SSH enabled.</w:t>
+      </w:r>
+    </w:p>
+    <w:tbl>
+      <w:tblPr>
+        <w:tblStyle w:val="TableGrid"/>
+        <w:tblW w:type="dxa" w:w="9360"/>
+        <w:jc w:val="left"/>
+        <w:tblLayout w:type="fixed"/>
+        <w:tblLook w:firstColumn="1" w:firstRow="1" w:lastColumn="0" w:lastRow="0" w:noHBand="0" w:noVBand="1" w:val="04A0"/>
+        <w:tblInd w:w="120" w:type="dxa"/>
+      </w:tblPr>
+      <w:tblGrid>
+        <w:gridCol w:w="2300"/>
+        <w:gridCol w:w="7060"/>
+      </w:tblGrid>
+      <w:tr>
+        <w:trPr>
+          <w:tblHeader w:val="true"/>
+        </w:trPr>
+        <w:tc>
+          <w:tcPr>
+            <w:tcW w:type="dxa" w:w="2300"/>
+            <w:tcMar>
+              <w:top w:w="80" w:type="dxa"/>
+              <w:start w:w="120" w:type="dxa"/>
+              <w:bottom w:w="80" w:type="dxa"/>
+              <w:end w:w="120" w:type="dxa"/>
+            </w:tcMar>
+            <w:vAlign w:val="center"/>
+            <w:shd w:fill="E8EEF5"/>
+          </w:tcPr>
+          <w:p>
+            <w:pPr>
+              <w:spacing w:after="0"/>
+            </w:pPr>
+            <w:r>
+              <w:rPr>
+                <w:rFonts w:ascii="Calibri" w:hAnsi="Calibri"/>
+                <w:b/>
+                <w:i w:val="0"/>
+                <w:color w:val="17365D"/>
+                <w:sz w:val="20"/>
+              </w:rPr>
+              <w:t>Category</w:t>
+            </w:r>
+          </w:p>
+        </w:tc>
+        <w:tc>
+          <w:tcPr>
+            <w:tcW w:type="dxa" w:w="7060"/>
+            <w:tcMar>
+              <w:top w:w="80" w:type="dxa"/>
+              <w:start w:w="120" w:type="dxa"/>
+              <w:bottom w:w="80" w:type="dxa"/>
+              <w:end w:w="120" w:type="dxa"/>
+            </w:tcMar>
+            <w:vAlign w:val="center"/>
+            <w:shd w:fill="E8EEF5"/>
+          </w:tcPr>
+          <w:p>
+            <w:pPr>
+              <w:spacing w:after="0"/>
+            </w:pPr>
+            <w:r>
+              <w:rPr>
+                <w:rFonts w:ascii="Calibri" w:hAnsi="Calibri"/>
+                <w:b/>
+                <w:i w:val="0"/>
+                <w:color w:val="17365D"/>
+                <w:sz w:val="20"/>
+              </w:rPr>
+              <w:t>Required software or condition</w:t>
+            </w:r>
+          </w:p>
+        </w:tc>
+      </w:tr>
+      <w:tr>
+        <w:tc>
+          <w:tcPr>
+            <w:tcW w:type="dxa" w:w="2300"/>
+            <w:tcMar>
+              <w:top w:w="80" w:type="dxa"/>
+              <w:start w:w="120" w:type="dxa"/>
+              <w:bottom w:w="80" w:type="dxa"/>
+              <w:end w:w="120" w:type="dxa"/>
+            </w:tcMar>
+            <w:vAlign w:val="center"/>
+          </w:tcPr>
+          <w:p>
+            <w:pPr>
+              <w:spacing w:after="0"/>
+            </w:pPr>
+            <w:r>
+              <w:rPr>
+                <w:rFonts w:ascii="Calibri" w:hAnsi="Calibri"/>
+                <w:b w:val="0"/>
+                <w:i w:val="0"/>
+                <w:color w:val="202124"/>
+                <w:sz w:val="19"/>
+              </w:rPr>
+              <w:t>Base Ubuntu</w:t>
+            </w:r>
+          </w:p>
+        </w:tc>
+        <w:tc>
+          <w:tcPr>
+            <w:tcW w:type="dxa" w:w="7060"/>
+            <w:tcMar>
+              <w:top w:w="80" w:type="dxa"/>
+              <w:start w:w="120" w:type="dxa"/>
+              <w:bottom w:w="80" w:type="dxa"/>
+              <w:end w:w="120" w:type="dxa"/>
+            </w:tcMar>
+            <w:vAlign w:val="center"/>
+          </w:tcPr>
+          <w:p>
+            <w:pPr>
+              <w:spacing w:after="0"/>
+            </w:pPr>
+            <w:r>
+              <w:rPr>
+                <w:rFonts w:ascii="Calibri" w:hAnsi="Calibri"/>
+                <w:b w:val="0"/>
+                <w:i w:val="0"/>
+                <w:color w:val="202124"/>
+                <w:sz w:val="19"/>
+              </w:rPr>
+              <w:t>python3, openssh-server, sudo, ca-certificates, curl, gnupg, tar and unzip</w:t>
+            </w:r>
+          </w:p>
+        </w:tc>
+      </w:tr>
+      <w:tr>
+        <w:tc>
+          <w:tcPr>
+            <w:tcW w:type="dxa" w:w="2300"/>
+            <w:tcMar>
+              <w:top w:w="80" w:type="dxa"/>
+              <w:start w:w="120" w:type="dxa"/>
+              <w:bottom w:w="80" w:type="dxa"/>
+              <w:end w:w="120" w:type="dxa"/>
+            </w:tcMar>
+            <w:vAlign w:val="center"/>
+          </w:tcPr>
+          <w:p>
+            <w:pPr>
+              <w:spacing w:after="0"/>
+            </w:pPr>
+            <w:r>
+              <w:rPr>
+                <w:rFonts w:ascii="Calibri" w:hAnsi="Calibri"/>
+                <w:b w:val="0"/>
+                <w:i w:val="0"/>
+                <w:color w:val="202124"/>
+                <w:sz w:val="19"/>
+              </w:rPr>
+              <w:t>Container runtime</w:t>
+            </w:r>
+          </w:p>
+        </w:tc>
+        <w:tc>
+          <w:tcPr>
+            <w:tcW w:type="dxa" w:w="7060"/>
+            <w:tcMar>
+              <w:top w:w="80" w:type="dxa"/>
+              <w:start w:w="120" w:type="dxa"/>
+              <w:bottom w:w="80" w:type="dxa"/>
+              <w:end w:w="120" w:type="dxa"/>
+            </w:tcMar>
+            <w:vAlign w:val="center"/>
+          </w:tcPr>
+          <w:p>
+            <w:pPr>
+              <w:spacing w:after="0"/>
+            </w:pPr>
+            <w:r>
+              <w:rPr>
+                <w:rFonts w:ascii="Calibri" w:hAnsi="Calibri"/>
+                <w:b w:val="0"/>
+                <w:i w:val="0"/>
+                <w:color w:val="202124"/>
+                <w:sz w:val="19"/>
+              </w:rPr>
+              <w:t>docker-ce, docker-ce-cli, containerd.io and docker-buildx-plugin; Docker 27.4.0 or newer</w:t>
+            </w:r>
+          </w:p>
+        </w:tc>
+      </w:tr>
+      <w:tr>
+        <w:tc>
+          <w:tcPr>
+            <w:tcW w:type="dxa" w:w="2300"/>
+            <w:tcMar>
+              <w:top w:w="80" w:type="dxa"/>
+              <w:start w:w="120" w:type="dxa"/>
+              <w:bottom w:w="80" w:type="dxa"/>
+              <w:end w:w="120" w:type="dxa"/>
+            </w:tcMar>
+            <w:vAlign w:val="center"/>
+          </w:tcPr>
+          <w:p>
+            <w:pPr>
+              <w:spacing w:after="0"/>
+            </w:pPr>
+            <w:r>
+              <w:rPr>
+                <w:rFonts w:ascii="Calibri" w:hAnsi="Calibri"/>
+                <w:b w:val="0"/>
+                <w:i w:val="0"/>
+                <w:color w:val="202124"/>
+                <w:sz w:val="19"/>
+              </w:rPr>
+              <w:t>Kubernetes client</w:t>
+            </w:r>
+          </w:p>
+        </w:tc>
+        <w:tc>
+          <w:tcPr>
+            <w:tcW w:type="dxa" w:w="7060"/>
+            <w:tcMar>
+              <w:top w:w="80" w:type="dxa"/>
+              <w:start w:w="120" w:type="dxa"/>
+              <w:bottom w:w="80" w:type="dxa"/>
+              <w:end w:w="120" w:type="dxa"/>
+            </w:tcMar>
+            <w:vAlign w:val="center"/>
+          </w:tcPr>
+          <w:p>
+            <w:pPr>
+              <w:spacing w:after="0"/>
+            </w:pPr>
+            <w:r>
+              <w:rPr>
+                <w:rFonts w:ascii="Calibri" w:hAnsi="Calibri"/>
+                <w:b w:val="0"/>
+                <w:i w:val="0"/>
+                <w:color w:val="202124"/>
+                <w:sz w:val="19"/>
+              </w:rPr>
+              <w:t>kubectl 1.35.x for Linux AMD64</w:t>
+            </w:r>
+          </w:p>
+        </w:tc>
+      </w:tr>
+      <w:tr>
+        <w:tc>
+          <w:tcPr>
+            <w:tcW w:type="dxa" w:w="2300"/>
+            <w:tcMar>
+              <w:top w:w="80" w:type="dxa"/>
+              <w:start w:w="120" w:type="dxa"/>
+              <w:bottom w:w="80" w:type="dxa"/>
+              <w:end w:w="120" w:type="dxa"/>
+            </w:tcMar>
+            <w:vAlign w:val="center"/>
+          </w:tcPr>
+          <w:p>
+            <w:pPr>
+              <w:spacing w:after="0"/>
+            </w:pPr>
+            <w:r>
+              <w:rPr>
+                <w:rFonts w:ascii="Calibri" w:hAnsi="Calibri"/>
+                <w:b w:val="0"/>
+                <w:i w:val="0"/>
+                <w:color w:val="202124"/>
+                <w:sz w:val="19"/>
+              </w:rPr>
+              <w:t>NKP command line</w:t>
+            </w:r>
+          </w:p>
+        </w:tc>
+        <w:tc>
+          <w:tcPr>
+            <w:tcW w:type="dxa" w:w="7060"/>
+            <w:tcMar>
+              <w:top w:w="80" w:type="dxa"/>
+              <w:start w:w="120" w:type="dxa"/>
+              <w:bottom w:w="80" w:type="dxa"/>
+              <w:end w:w="120" w:type="dxa"/>
+            </w:tcMar>
+            <w:vAlign w:val="center"/>
+          </w:tcPr>
+          <w:p>
+            <w:pPr>
+              <w:spacing w:after="0"/>
+            </w:pPr>
+            <w:r>
+              <w:rPr>
+                <w:rFonts w:ascii="Calibri" w:hAnsi="Calibri"/>
+                <w:b w:val="0"/>
+                <w:i w:val="0"/>
+                <w:color w:val="202124"/>
+                <w:sz w:val="19"/>
+              </w:rPr>
+              <w:t>NKP CLI 2.18.x for Linux AMD64</w:t>
+            </w:r>
+          </w:p>
+        </w:tc>
+      </w:tr>
+      <w:tr>
+        <w:tc>
+          <w:tcPr>
+            <w:tcW w:type="dxa" w:w="2300"/>
+            <w:tcMar>
+              <w:top w:w="80" w:type="dxa"/>
+              <w:start w:w="120" w:type="dxa"/>
+              <w:bottom w:w="80" w:type="dxa"/>
+              <w:end w:w="120" w:type="dxa"/>
+            </w:tcMar>
+            <w:vAlign w:val="center"/>
+          </w:tcPr>
+          <w:p>
+            <w:pPr>
+              <w:spacing w:after="0"/>
+            </w:pPr>
+            <w:r>
+              <w:rPr>
+                <w:rFonts w:ascii="Calibri" w:hAnsi="Calibri"/>
+                <w:b w:val="0"/>
+                <w:i w:val="0"/>
+                <w:color w:val="202124"/>
+                <w:sz w:val="19"/>
+              </w:rPr>
+              <w:t>Air-gapped content</w:t>
+            </w:r>
+          </w:p>
+        </w:tc>
+        <w:tc>
+          <w:tcPr>
+            <w:tcW w:type="dxa" w:w="7060"/>
+            <w:tcMar>
+              <w:top w:w="80" w:type="dxa"/>
+              <w:start w:w="120" w:type="dxa"/>
+              <w:bottom w:w="80" w:type="dxa"/>
+              <w:end w:w="120" w:type="dxa"/>
+            </w:tcMar>
+            <w:vAlign w:val="center"/>
+          </w:tcPr>
+          <w:p>
+            <w:pPr>
+              <w:spacing w:after="0"/>
+            </w:pPr>
+            <w:r>
+              <w:rPr>
+                <w:rFonts w:ascii="Calibri" w:hAnsi="Calibri"/>
+                <w:b w:val="0"/>
+                <w:i w:val="0"/>
+                <w:color w:val="202124"/>
+                <w:sz w:val="19"/>
+              </w:rPr>
+              <w:t>Complete NKP 2.18 air-gapped bundle plus Docker DEBs and every dependency</w:t>
+            </w:r>
+          </w:p>
+        </w:tc>
+      </w:tr>
+    </w:tbl>
+    <w:p>
+      <w:pPr>
+        <w:spacing w:after="0"/>
+      </w:pPr>
+    </w:p>
+    <w:p>
+      <w:pPr>
+        <w:pStyle w:val="Heading3"/>
+      </w:pPr>
+      <w:r>
+        <w:t>Connected bastion</w:t>
+      </w:r>
+    </w:p>
+    <w:p>
+      <w:pPr/>
+      <w:r>
+        <w:rPr>
+          <w:rFonts w:ascii="Calibri" w:hAnsi="Calibri"/>
+          <w:b w:val="0"/>
+          <w:i w:val="0"/>
+          <w:color w:val="202124"/>
+          <w:sz w:val="22"/>
+        </w:rPr>
+        <w:t>The automation installs ca-certificates, curl, gnupg, tar and unzip, configures the Docker and Kubernetes repositories, and installs Docker 27.4+ plus kubectl 1.35.x. The controller then copies and installs the NKP CLI.</w:t>
+      </w:r>
+    </w:p>
+    <w:p>
+      <w:pPr>
+        <w:pStyle w:val="Heading3"/>
+      </w:pPr>
+      <w:r>
+        <w:t>Air-gapped bastion</w:t>
+      </w:r>
+    </w:p>
+    <w:p>
+      <w:pPr/>
+      <w:r>
+        <w:rPr>
+          <w:rFonts w:ascii="Calibri" w:hAnsi="Calibri"/>
+          <w:b w:val="0"/>
+          <w:i w:val="0"/>
+          <w:color w:val="202124"/>
+          <w:sz w:val="22"/>
+        </w:rPr>
+        <w:t>The base Ubuntu image must already contain Python 3, OpenSSH and sudo. Supply Docker 27.4+ Ubuntu DEBs with all dependencies, the kubectl 1.35 AMD64 binary, the NKP CLI archive and the complete NKP 2.18 air-gapped bundle in the artifact directories above.</w:t>
+      </w:r>
+    </w:p>
+    <w:tbl>
+      <w:tblPr>
+        <w:tblStyle w:val="TableGrid"/>
+        <w:tblW w:type="dxa" w:w="9360"/>
+        <w:jc w:val="left"/>
+        <w:tblLayout w:type="fixed"/>
+        <w:tblLook w:firstColumn="1" w:firstRow="1" w:lastColumn="0" w:lastRow="0" w:noHBand="0" w:noVBand="1" w:val="04A0"/>
+        <w:tblInd w:w="120" w:type="dxa"/>
+      </w:tblPr>
+      <w:tblGrid>
+        <w:gridCol w:w="2600"/>
+        <w:gridCol w:w="6760"/>
+      </w:tblGrid>
+      <w:tr>
+        <w:trPr>
+          <w:tblHeader w:val="true"/>
+        </w:trPr>
+        <w:tc>
+          <w:tcPr>
+            <w:tcW w:type="dxa" w:w="2600"/>
+            <w:tcMar>
+              <w:top w:w="80" w:type="dxa"/>
+              <w:start w:w="120" w:type="dxa"/>
+              <w:bottom w:w="80" w:type="dxa"/>
+              <w:end w:w="120" w:type="dxa"/>
+            </w:tcMar>
+            <w:vAlign w:val="center"/>
+            <w:shd w:fill="E8EEF5"/>
+          </w:tcPr>
+          <w:p>
+            <w:pPr>
+              <w:spacing w:after="0"/>
+            </w:pPr>
+            <w:r>
+              <w:rPr>
+                <w:rFonts w:ascii="Calibri" w:hAnsi="Calibri"/>
+                <w:b/>
+                <w:i w:val="0"/>
+                <w:color w:val="17365D"/>
+                <w:sz w:val="20"/>
+              </w:rPr>
+              <w:t>Bastion resource</w:t>
+            </w:r>
+          </w:p>
+        </w:tc>
+        <w:tc>
+          <w:tcPr>
+            <w:tcW w:type="dxa" w:w="6760"/>
+            <w:tcMar>
+              <w:top w:w="80" w:type="dxa"/>
+              <w:start w:w="120" w:type="dxa"/>
+              <w:bottom w:w="80" w:type="dxa"/>
+              <w:end w:w="120" w:type="dxa"/>
+            </w:tcMar>
+            <w:vAlign w:val="center"/>
+            <w:shd w:fill="E8EEF5"/>
+          </w:tcPr>
+          <w:p>
+            <w:pPr>
+              <w:spacing w:after="0"/>
+            </w:pPr>
+            <w:r>
+              <w:rPr>
+                <w:rFonts w:ascii="Calibri" w:hAnsi="Calibri"/>
+                <w:b/>
+                <w:i w:val="0"/>
+                <w:color w:val="17365D"/>
+                <w:sz w:val="20"/>
+              </w:rPr>
+              <w:t>Minimum used by this project</w:t>
+            </w:r>
+          </w:p>
+        </w:tc>
+      </w:tr>
+      <w:tr>
+        <w:tc>
+          <w:tcPr>
+            <w:tcW w:type="dxa" w:w="2600"/>
+            <w:tcMar>
+              <w:top w:w="80" w:type="dxa"/>
+              <w:start w:w="120" w:type="dxa"/>
+              <w:bottom w:w="80" w:type="dxa"/>
+              <w:end w:w="120" w:type="dxa"/>
+            </w:tcMar>
+            <w:vAlign w:val="center"/>
+          </w:tcPr>
+          <w:p>
+            <w:pPr>
+              <w:spacing w:after="0"/>
+            </w:pPr>
+            <w:r>
+              <w:rPr>
+                <w:rFonts w:ascii="Calibri" w:hAnsi="Calibri"/>
+                <w:b w:val="0"/>
+                <w:i w:val="0"/>
+                <w:color w:val="202124"/>
+                <w:sz w:val="19"/>
+              </w:rPr>
+              <w:t>CPU architecture</w:t>
+            </w:r>
+          </w:p>
+        </w:tc>
+        <w:tc>
+          <w:tcPr>
+            <w:tcW w:type="dxa" w:w="6760"/>
+            <w:tcMar>
+              <w:top w:w="80" w:type="dxa"/>
+              <w:start w:w="120" w:type="dxa"/>
+              <w:bottom w:w="80" w:type="dxa"/>
+              <w:end w:w="120" w:type="dxa"/>
+            </w:tcMar>
+            <w:vAlign w:val="center"/>
+          </w:tcPr>
+          <w:p>
+            <w:pPr>
+              <w:spacing w:after="0"/>
+            </w:pPr>
+            <w:r>
+              <w:rPr>
+                <w:rFonts w:ascii="Calibri" w:hAnsi="Calibri"/>
+                <w:b w:val="0"/>
+                <w:i w:val="0"/>
+                <w:color w:val="202124"/>
+                <w:sz w:val="19"/>
+              </w:rPr>
+              <w:t>x86_64 / AMD64</w:t>
+            </w:r>
+          </w:p>
+        </w:tc>
+      </w:tr>
+      <w:tr>
+        <w:tc>
+          <w:tcPr>
+            <w:tcW w:type="dxa" w:w="2600"/>
+            <w:tcMar>
+              <w:top w:w="80" w:type="dxa"/>
+              <w:start w:w="120" w:type="dxa"/>
+              <w:bottom w:w="80" w:type="dxa"/>
+              <w:end w:w="120" w:type="dxa"/>
+            </w:tcMar>
+            <w:vAlign w:val="center"/>
+          </w:tcPr>
+          <w:p>
+            <w:pPr>
+              <w:spacing w:after="0"/>
+            </w:pPr>
+            <w:r>
+              <w:rPr>
+                <w:rFonts w:ascii="Calibri" w:hAnsi="Calibri"/>
+                <w:b w:val="0"/>
+                <w:i w:val="0"/>
+                <w:color w:val="202124"/>
+                <w:sz w:val="19"/>
+              </w:rPr>
+              <w:t>Operating system</w:t>
+            </w:r>
+          </w:p>
+        </w:tc>
+        <w:tc>
+          <w:tcPr>
+            <w:tcW w:type="dxa" w:w="6760"/>
+            <w:tcMar>
+              <w:top w:w="80" w:type="dxa"/>
+              <w:start w:w="120" w:type="dxa"/>
+              <w:bottom w:w="80" w:type="dxa"/>
+              <w:end w:w="120" w:type="dxa"/>
+            </w:tcMar>
+            <w:vAlign w:val="center"/>
+          </w:tcPr>
+          <w:p>
+            <w:pPr>
+              <w:spacing w:after="0"/>
+            </w:pPr>
+            <w:r>
+              <w:rPr>
+                <w:rFonts w:ascii="Calibri" w:hAnsi="Calibri"/>
+                <w:b w:val="0"/>
+                <w:i w:val="0"/>
+                <w:color w:val="202124"/>
+                <w:sz w:val="19"/>
+              </w:rPr>
+              <w:t>Nutanix-provided Ubuntu 24.04 NKP image</w:t>
+            </w:r>
+          </w:p>
+        </w:tc>
+      </w:tr>
+      <w:tr>
+        <w:tc>
+          <w:tcPr>
+            <w:tcW w:type="dxa" w:w="2600"/>
+            <w:tcMar>
+              <w:top w:w="80" w:type="dxa"/>
+              <w:start w:w="120" w:type="dxa"/>
+              <w:bottom w:w="80" w:type="dxa"/>
+              <w:end w:w="120" w:type="dxa"/>
+            </w:tcMar>
+            <w:vAlign w:val="center"/>
+          </w:tcPr>
+          <w:p>
+            <w:pPr>
+              <w:spacing w:after="0"/>
+            </w:pPr>
+            <w:r>
+              <w:rPr>
+                <w:rFonts w:ascii="Calibri" w:hAnsi="Calibri"/>
+                <w:b w:val="0"/>
+                <w:i w:val="0"/>
+                <w:color w:val="202124"/>
+                <w:sz w:val="19"/>
+              </w:rPr>
+              <w:t>Control groups</w:t>
+            </w:r>
+          </w:p>
+        </w:tc>
+        <w:tc>
+          <w:tcPr>
+            <w:tcW w:type="dxa" w:w="6760"/>
+            <w:tcMar>
+              <w:top w:w="80" w:type="dxa"/>
+              <w:start w:w="120" w:type="dxa"/>
+              <w:bottom w:w="80" w:type="dxa"/>
+              <w:end w:w="120" w:type="dxa"/>
+            </w:tcMar>
+            <w:vAlign w:val="center"/>
+          </w:tcPr>
+          <w:p>
+            <w:pPr>
+              <w:spacing w:after="0"/>
+            </w:pPr>
+            <w:r>
+              <w:rPr>
+                <w:rFonts w:ascii="Calibri" w:hAnsi="Calibri"/>
+                <w:b w:val="0"/>
+                <w:i w:val="0"/>
+                <w:color w:val="202124"/>
+                <w:sz w:val="19"/>
+              </w:rPr>
+              <w:t>cgroups v2 enabled</w:t>
+            </w:r>
+          </w:p>
+        </w:tc>
+      </w:tr>
+      <w:tr>
+        <w:tc>
+          <w:tcPr>
+            <w:tcW w:type="dxa" w:w="2600"/>
+            <w:tcMar>
+              <w:top w:w="80" w:type="dxa"/>
+              <w:start w:w="120" w:type="dxa"/>
+              <w:bottom w:w="80" w:type="dxa"/>
+              <w:end w:w="120" w:type="dxa"/>
+            </w:tcMar>
+            <w:vAlign w:val="center"/>
+          </w:tcPr>
+          <w:p>
+            <w:pPr>
+              <w:spacing w:after="0"/>
+            </w:pPr>
+            <w:r>
+              <w:rPr>
+                <w:rFonts w:ascii="Calibri" w:hAnsi="Calibri"/>
+                <w:b w:val="0"/>
+                <w:i w:val="0"/>
+                <w:color w:val="202124"/>
+                <w:sz w:val="19"/>
+              </w:rPr>
+              <w:t>Compute</w:t>
+            </w:r>
+          </w:p>
+        </w:tc>
+        <w:tc>
+          <w:tcPr>
+            <w:tcW w:type="dxa" w:w="6760"/>
+            <w:tcMar>
+              <w:top w:w="80" w:type="dxa"/>
+              <w:start w:w="120" w:type="dxa"/>
+              <w:bottom w:w="80" w:type="dxa"/>
+              <w:end w:w="120" w:type="dxa"/>
+            </w:tcMar>
+            <w:vAlign w:val="center"/>
+          </w:tcPr>
+          <w:p>
+            <w:pPr>
+              <w:spacing w:after="0"/>
+            </w:pPr>
+            <w:r>
+              <w:rPr>
+                <w:rFonts w:ascii="Calibri" w:hAnsi="Calibri"/>
+                <w:b w:val="0"/>
+                <w:i w:val="0"/>
+                <w:color w:val="202124"/>
+                <w:sz w:val="19"/>
+              </w:rPr>
+              <w:t>4 vCPU and 16 GiB RAM</w:t>
+            </w:r>
+          </w:p>
+        </w:tc>
+      </w:tr>
+      <w:tr>
+        <w:tc>
+          <w:tcPr>
+            <w:tcW w:type="dxa" w:w="2600"/>
+            <w:tcMar>
+              <w:top w:w="80" w:type="dxa"/>
+              <w:start w:w="120" w:type="dxa"/>
+              <w:bottom w:w="80" w:type="dxa"/>
+              <w:end w:w="120" w:type="dxa"/>
+            </w:tcMar>
+            <w:vAlign w:val="center"/>
+          </w:tcPr>
+          <w:p>
+            <w:pPr>
+              <w:spacing w:after="0"/>
+            </w:pPr>
+            <w:r>
+              <w:rPr>
+                <w:rFonts w:ascii="Calibri" w:hAnsi="Calibri"/>
+                <w:b w:val="0"/>
+                <w:i w:val="0"/>
+                <w:color w:val="202124"/>
+                <w:sz w:val="19"/>
+              </w:rPr>
+              <w:t>Storage</w:t>
+            </w:r>
+          </w:p>
+        </w:tc>
+        <w:tc>
+          <w:tcPr>
+            <w:tcW w:type="dxa" w:w="6760"/>
+            <w:tcMar>
+              <w:top w:w="80" w:type="dxa"/>
+              <w:start w:w="120" w:type="dxa"/>
+              <w:bottom w:w="80" w:type="dxa"/>
+              <w:end w:w="120" w:type="dxa"/>
+            </w:tcMar>
+            <w:vAlign w:val="center"/>
+          </w:tcPr>
+          <w:p>
+            <w:pPr>
+              <w:spacing w:after="0"/>
+            </w:pPr>
+            <w:r>
+              <w:rPr>
+                <w:rFonts w:ascii="Calibri" w:hAnsi="Calibri"/>
+                <w:b w:val="0"/>
+                <w:i w:val="0"/>
+                <w:color w:val="202124"/>
+                <w:sz w:val="19"/>
+              </w:rPr>
+              <w:t>200 GiB disk</w:t>
+            </w:r>
+          </w:p>
+        </w:tc>
+      </w:tr>
+    </w:tbl>
+    <w:p>
+      <w:pPr>
+        <w:spacing w:after="0"/>
+      </w:pPr>
+    </w:p>
+    <w:tbl>
+      <w:tblPr>
+        <w:tblW w:type="dxa" w:w="9360"/>
+        <w:jc w:val="left"/>
+        <w:tblLayout w:type="fixed"/>
+        <w:tblLook w:firstColumn="1" w:firstRow="1" w:lastColumn="0" w:lastRow="0" w:noHBand="0" w:noVBand="1" w:val="04A0"/>
+        <w:tblInd w:w="120" w:type="dxa"/>
+      </w:tblPr>
+      <w:tblGrid>
+        <w:gridCol w:w="9360"/>
+      </w:tblGrid>
+      <w:tr>
+        <w:tc>
+          <w:tcPr>
+            <w:tcW w:type="dxa" w:w="9360"/>
+            <w:tcMar>
+              <w:top w:w="80" w:type="dxa"/>
+              <w:start w:w="120" w:type="dxa"/>
+              <w:bottom w:w="80" w:type="dxa"/>
+              <w:end w:w="120" w:type="dxa"/>
+            </w:tcMar>
+            <w:vAlign w:val="center"/>
+            <w:shd w:fill="FDECEC"/>
+          </w:tcPr>
+          <w:p>
+            <w:pPr>
+              <w:spacing w:after="0"/>
+            </w:pPr>
+            <w:r>
+              <w:rPr>
+                <w:rFonts w:ascii="Calibri" w:hAnsi="Calibri"/>
+                <w:b/>
+                <w:i w:val="0"/>
+                <w:color w:val="9B1C1C"/>
+                <w:sz w:val="22"/>
+              </w:rPr>
+              <w:t xml:space="preserve">Connectivity: </w:t>
+            </w:r>
+            <w:r>
+              <w:rPr>
+                <w:rFonts w:ascii="Calibri" w:hAnsi="Calibri"/>
+                <w:b w:val="0"/>
+                <w:i w:val="0"/>
+                <w:color w:val="202124"/>
+                <w:sz w:val="22"/>
+              </w:rPr>
+              <w:t>The bastion requires DNS and NTP, TCP 9440 access to Prism Central, SSH reachability from the controller, and network access to all future NKP nodes. Connected mode also requires access to the configured public package and container registries.</w:t>
             </w:r>
           </w:p>
         </w:tc>

</xml_diff>